<commit_message>
Remove version declaration from Docker Compose files for Day 3 lab
</commit_message>
<xml_diff>
--- a/Week_01/Day_03/Lab/Day_03_Lab_Guide.docx
+++ b/Week_01/Day_03/Lab/Day_03_Lab_Guide.docx
@@ -187,7 +187,7 @@
         <w:pStyle w:val="ListBullet"/>
       </w:pPr>
       <w:r>
-        <w:t>Consumer groups, partition assignment and rebalancing: Exercises 6, 7 and 8.</w:t>
+        <w:t>Consumer groups, partition assignment and rebalancing: Exercises 9 and 10.</w:t>
       </w:r>
     </w:p>
     <w:p>
@@ -195,7 +195,7 @@
         <w:pStyle w:val="ListBullet"/>
       </w:pPr>
       <w:r>
-        <w:t>Offsets, manual commits, lag and replay: Exercises 7 and 9.</w:t>
+        <w:t>Offsets, manual commits, lag and replay: Exercises 8 and 11.</w:t>
       </w:r>
     </w:p>
     <w:p>
@@ -203,7 +203,7 @@
         <w:pStyle w:val="ListBullet"/>
       </w:pPr>
       <w:r>
-        <w:t>Producer durability and delivery semantics: Exercises 5 and 6.</w:t>
+        <w:t>Producer durability and delivery semantics: Exercises 5, 6 and 7.</w:t>
       </w:r>
     </w:p>
     <w:p>
@@ -219,7 +219,7 @@
         <w:pStyle w:val="ListBullet"/>
       </w:pPr>
       <w:r>
-        <w:t>Kafka Connect source/sink direction, task status, recovery and troubleshooting: Exercises 11, 12 and 13.</w:t>
+        <w:t>Kafka Connect source/sink direction, task status, recovery and troubleshooting: Exercises 12, 13 and 14.</w:t>
       </w:r>
     </w:p>
     <w:p>
@@ -227,7 +227,35 @@
         <w:pStyle w:val="ListBullet"/>
       </w:pPr>
       <w:r>
-        <w:t>Kafka UI evidence and ecosystem tool choice: Exercises 3 and 14.</w:t>
+        <w:t>Kafka UI evidence and ecosystem tool choice: Exercises 3 and 15.</w:t>
+      </w:r>
+    </w:p>
+    <w:p>
+      <w:pPr>
+        <w:pStyle w:val="Heading2"/>
+      </w:pPr>
+      <w:r>
+        <w:t>Compose File Note</w:t>
+      </w:r>
+    </w:p>
+    <w:p>
+      <w:r>
+        <w:t>Use docker-compose.yml for the Day 3 learner lab. It is the active three-broker KRaft stack with Kafka Connect and Kafka UI.</w:t>
+      </w:r>
+    </w:p>
+    <w:p>
+      <w:r>
+        <w:t>docker-compose-3broker.yml is currently an identical named copy of docker-compose.yml. It is useful only when a trainer wants the filename to make the topology explicit.</w:t>
+      </w:r>
+    </w:p>
+    <w:p>
+      <w:r>
+        <w:t>docker-compose-original.yml is a legacy single-broker reference for the earlier FileStream-only lab. It is not needed for the Day 3 exercises because it cannot demonstrate replication factor 3, ISR changes, broker failover, or Kafka UI evidence.</w:t>
+      </w:r>
+    </w:p>
+    <w:p>
+      <w:r>
+        <w:t>Learner recommendation: run only docker compose up -d from this folder unless the trainer specifically asks you to compare the old single-broker topology.</w:t>
       </w:r>
     </w:p>
     <w:p>
@@ -410,11 +438,6 @@
     </w:p>
     <w:p>
       <w:r>
-        <w:t>docker compose ps</w:t>
-      </w:r>
-    </w:p>
-    <w:p>
-      <w:r>
         <w:rPr>
           <w:b/>
         </w:rPr>
@@ -433,11 +456,6 @@
     </w:p>
     <w:p>
       <w:r>
-        <w:t>docker compose ps</w:t>
-      </w:r>
-    </w:p>
-    <w:p>
-      <w:r>
         <w:rPr>
           <w:b/>
         </w:rPr>
@@ -525,11 +543,6 @@
     </w:p>
     <w:p>
       <w:r>
-        <w:t>curl http://localhost:8083/connector-plugins</w:t>
-      </w:r>
-    </w:p>
-    <w:p>
-      <w:r>
         <w:rPr>
           <w:b/>
         </w:rPr>
@@ -543,11 +556,6 @@
     </w:p>
     <w:p>
       <w:r>
-        <w:t>curl http://localhost:8083/connector-plugins</w:t>
-      </w:r>
-    </w:p>
-    <w:p>
-      <w:r>
         <w:rPr>
           <w:b/>
         </w:rPr>
@@ -1130,7 +1138,7 @@
     </w:p>
     <w:p>
       <w:r>
-        <w:t>python consumer.py --topic orders-replicated --bootstrap localhost:9092 --group cg-day3-python --max-messages 12 --reset earliest</w:t>
+        <w:t>python consumer.py --topic orders-replicated --bootstrap localhost:9092 --group cg-day3-python --max-messages 16 --reset earliest</w:t>
       </w:r>
     </w:p>
     <w:p>
@@ -1148,12 +1156,116 @@
     </w:p>
     <w:p>
       <w:r>
-        <w:t>python3 consumer.py --topic orders-replicated --bootstrap localhost:9092 --group cg-day3-python --max-messages 12 --reset earliest</w:t>
+        <w:t>python3 consumer.py --topic orders-replicated --bootstrap localhost:9092 --group cg-day3-python --max-messages 16 --reset earliest</w:t>
       </w:r>
     </w:p>
     <w:p>
       <w:r>
         <w:t>docker compose exec broker1 kafka-consumer-groups --bootstrap-server broker1:29092,broker2:29092,broker3:29092 --describe --group cg-day3-python</w:t>
+      </w:r>
+    </w:p>
+    <w:p>
+      <w:r>
+        <w:t>Explanation: The consumer prints each record and then commits its offset. Use 16 messages when following the guide in order because Exercise 6 produces 12 records and Exercise 7 adds 4 more. The group description shows whether the group has caught up to the topic end.</w:t>
+      </w:r>
+    </w:p>
+    <w:p>
+      <w:r>
+        <w:rPr>
+          <w:b/>
+        </w:rPr>
+        <w:t xml:space="preserve">Mini-check: </w:t>
+      </w:r>
+      <w:r>
+        <w:t>What does LAG 0 mean?</w:t>
+      </w:r>
+    </w:p>
+    <w:p>
+      <w:r>
+        <w:rPr>
+          <w:b/>
+        </w:rPr>
+        <w:t xml:space="preserve">Solution: </w:t>
+      </w:r>
+      <w:r>
+        <w:t>The group committed offset has reached the current log end offset for its assigned partitions.</w:t>
+      </w:r>
+    </w:p>
+    <w:p>
+      <w:r>
+        <w:rPr>
+          <w:b/>
+        </w:rPr>
+        <w:t xml:space="preserve">Evidence to capture: </w:t>
+      </w:r>
+      <w:r>
+        <w:t>Consumer output with `commit=ok` and group description showing LAG 0.</w:t>
+      </w:r>
+    </w:p>
+    <w:p>
+      <w:pPr>
+        <w:pStyle w:val="Heading1"/>
+      </w:pPr>
+      <w:r>
+        <w:t>Exercise 9: Prove Independent Consumer Groups</w:t>
+      </w:r>
+    </w:p>
+    <w:p>
+      <w:r>
+        <w:rPr>
+          <w:b/>
+        </w:rPr>
+        <w:t xml:space="preserve">Goal: </w:t>
+      </w:r>
+      <w:r>
+        <w:t>Show that different applications can read the same topic independently.</w:t>
+      </w:r>
+    </w:p>
+    <w:p>
+      <w:r>
+        <w:rPr>
+          <w:b/>
+        </w:rPr>
+        <w:t xml:space="preserve">What you learn: </w:t>
+      </w:r>
+      <w:r>
+        <w:t>Day 2 showed one consumer reading a topic. Day 3 shows that each consumer group keeps separate offsets.</w:t>
+      </w:r>
+    </w:p>
+    <w:p>
+      <w:r>
+        <w:rPr>
+          <w:b/>
+        </w:rPr>
+        <w:t>Windows Command Prompt</w:t>
+      </w:r>
+    </w:p>
+    <w:p>
+      <w:r>
+        <w:t>docker compose exec broker1 kafka-console-consumer --bootstrap-server broker1:29092,broker2:29092,broker3:29092 --topic orders-replicated --group cg-audit --from-beginning --timeout-ms 15000 --property print.partition=true --property print.offset=true</w:t>
+      </w:r>
+    </w:p>
+    <w:p>
+      <w:r>
+        <w:t>docker compose exec broker1 kafka-console-consumer --bootstrap-server broker1:29092,broker2:29092,broker3:29092 --topic orders-replicated --group cg-audit --from-beginning --timeout-ms 15000</w:t>
+      </w:r>
+    </w:p>
+    <w:p>
+      <w:r>
+        <w:rPr>
+          <w:b/>
+        </w:rPr>
+        <w:t>macOS / Linux Bash</w:t>
+      </w:r>
+    </w:p>
+    <w:p>
+      <w:r>
+        <w:t>docker compose exec broker1 kafka-console-consumer --bootstrap-server broker1:29092,broker2:29092,broker3:29092 --topic orders-replicated --group cg-audit --from-beginning --timeout-ms 15000 --property print.partition=true --property print.offset=true</w:t>
+      </w:r>
+    </w:p>
+    <w:p>
+      <w:r>
+        <w:t>docker compose exec broker1 kafka-console-consumer --bootstrap-server broker1:29092,broker2:29092,broker3:29092 --topic orders-replicated --group cg-audit --from-beginning --timeout-ms 15000</w:t>
       </w:r>
     </w:p>
     <w:p>
@@ -1164,7 +1276,7 @@
         <w:t xml:space="preserve">Explanation: </w:t>
       </w:r>
       <w:r>
-        <w:t>The consumer prints each record and then commits its offset. The group description shows whether the group has caught up to the topic end.</w:t>
+        <w:t>The first run reads because `cg-audit` has no committed offsets yet. The second run should not reread the same records unless new records arrived or the group offset was reset.</w:t>
       </w:r>
     </w:p>
     <w:p>
@@ -1175,7 +1287,7 @@
         <w:t xml:space="preserve">Mini-check: </w:t>
       </w:r>
       <w:r>
-        <w:t>What does LAG 0 mean?</w:t>
+        <w:t>Why does `cg-audit` not share progress with `cg-day3-python`?</w:t>
       </w:r>
     </w:p>
     <w:p>
@@ -1186,7 +1298,7 @@
         <w:t xml:space="preserve">Solution: </w:t>
       </w:r>
       <w:r>
-        <w:t>The group committed offset has reached the current log end offset for its assigned partitions.</w:t>
+        <w:t>Offsets are stored per group, so each application has its own progress bookmark.</w:t>
       </w:r>
     </w:p>
     <w:p>
@@ -1197,7 +1309,7 @@
         <w:t xml:space="preserve">Evidence to capture: </w:t>
       </w:r>
       <w:r>
-        <w:t>Consumer output with `commit=ok` and group description showing LAG 0.</w:t>
+        <w:t>Terminal output from both `cg-audit` runs and Kafka UI Consumer Groups view.</w:t>
       </w:r>
     </w:p>
     <w:p>
@@ -1205,7 +1317,7 @@
         <w:pStyle w:val="Heading1"/>
       </w:pPr>
       <w:r>
-        <w:t>Exercise 9: Prove Independent Consumer Groups</w:t>
+        <w:t>Exercise 10: Observe Partition Assignment and Rebalance</w:t>
       </w:r>
     </w:p>
     <w:p>
@@ -1216,7 +1328,7 @@
         <w:t xml:space="preserve">Goal: </w:t>
       </w:r>
       <w:r>
-        <w:t>Show that different applications can read the same topic independently.</w:t>
+        <w:t>See consumer group membership and partition ownership change when consumers join or leave.</w:t>
       </w:r>
     </w:p>
     <w:p>
@@ -1227,7 +1339,7 @@
         <w:t xml:space="preserve">What you learn: </w:t>
       </w:r>
       <w:r>
-        <w:t>Day 2 showed one consumer reading a topic. Day 3 shows that each consumer group keeps separate offsets.</w:t>
+        <w:t>Rebalancing is a core Day 3 theory topic. The lab evidence is group membership, assignment movement and temporary lag changes.</w:t>
       </w:r>
     </w:p>
     <w:p>
@@ -1240,12 +1352,12 @@
     </w:p>
     <w:p>
       <w:r>
-        <w:t>docker compose exec broker1 kafka-console-consumer --bootstrap-server broker1:29092,broker2:29092,broker3:29092 --topic orders-replicated --group cg-audit --from-beginning --timeout-ms 15000 --property print.partition=true --property print.offset=true</w:t>
-      </w:r>
-    </w:p>
-    <w:p>
-      <w:r>
-        <w:t>docker compose exec broker1 kafka-console-consumer --bootstrap-server broker1:29092,broker2:29092,broker3:29092 --topic orders-replicated --group cg-audit --from-beginning --timeout-ms 15000</w:t>
+        <w:t>docker compose exec broker1 kafka-console-consumer --bootstrap-server broker1:29092,broker2:29092,broker3:29092 --topic orders-replicated --group cg-live --from-beginning --property print.partition=true --property print.offset=true</w:t>
+      </w:r>
+    </w:p>
+    <w:p>
+      <w:r>
+        <w:t>docker compose exec broker1 kafka-consumer-groups --bootstrap-server broker1:29092,broker2:29092,broker3:29092 --describe --group cg-live</w:t>
       </w:r>
     </w:p>
     <w:p>
@@ -1258,12 +1370,12 @@
     </w:p>
     <w:p>
       <w:r>
-        <w:t>docker compose exec broker1 kafka-console-consumer --bootstrap-server broker1:29092,broker2:29092,broker3:29092 --topic orders-replicated --group cg-audit --from-beginning --timeout-ms 15000 --property print.partition=true --property print.offset=true</w:t>
-      </w:r>
-    </w:p>
-    <w:p>
-      <w:r>
-        <w:t>docker compose exec broker1 kafka-console-consumer --bootstrap-server broker1:29092,broker2:29092,broker3:29092 --topic orders-replicated --group cg-audit --from-beginning --timeout-ms 15000</w:t>
+        <w:t>docker compose exec broker1 kafka-console-consumer --bootstrap-server broker1:29092,broker2:29092,broker3:29092 --topic orders-replicated --group cg-live --from-beginning --property print.partition=true --property print.offset=true</w:t>
+      </w:r>
+    </w:p>
+    <w:p>
+      <w:r>
+        <w:t>docker compose exec broker1 kafka-consumer-groups --bootstrap-server broker1:29092,broker2:29092,broker3:29092 --describe --group cg-live</w:t>
       </w:r>
     </w:p>
     <w:p>
@@ -1274,7 +1386,7 @@
         <w:t xml:space="preserve">Explanation: </w:t>
       </w:r>
       <w:r>
-        <w:t>The first run reads because `cg-audit` has no committed offsets yet. The second run should not reread the same records unless new records arrived or the group offset was reset.</w:t>
+        <w:t>Run the consumer command in two separate terminals with the same group id. Stop one consumer with Ctrl+C and describe the group again. Kafka moves partition ownership among the remaining active members.</w:t>
       </w:r>
     </w:p>
     <w:p>
@@ -1285,7 +1397,7 @@
         <w:t xml:space="preserve">Mini-check: </w:t>
       </w:r>
       <w:r>
-        <w:t>Why does `cg-audit` not share progress with `cg-day3-python`?</w:t>
+        <w:t>Why can adding a consumer cause a short processing pause?</w:t>
       </w:r>
     </w:p>
     <w:p>
@@ -1296,7 +1408,7 @@
         <w:t xml:space="preserve">Solution: </w:t>
       </w:r>
       <w:r>
-        <w:t>Offsets are stored per group, so each application has its own progress bookmark.</w:t>
+        <w:t>The group must rebalance partition ownership before all members resume normal processing.</w:t>
       </w:r>
     </w:p>
     <w:p>
@@ -1307,7 +1419,7 @@
         <w:t xml:space="preserve">Evidence to capture: </w:t>
       </w:r>
       <w:r>
-        <w:t>Terminal output from both `cg-audit` runs and Kafka UI Consumer Groups view.</w:t>
+        <w:t>Consumer group description before and after a second consumer joins or leaves.</w:t>
       </w:r>
     </w:p>
     <w:p>
@@ -1315,7 +1427,7 @@
         <w:pStyle w:val="Heading1"/>
       </w:pPr>
       <w:r>
-        <w:t>Exercise 10: Observe Partition Assignment and Rebalance</w:t>
+        <w:t>Exercise 11: Inspect Lag and Reset Offsets</w:t>
       </w:r>
     </w:p>
     <w:p>
@@ -1326,7 +1438,7 @@
         <w:t xml:space="preserve">Goal: </w:t>
       </w:r>
       <w:r>
-        <w:t>See consumer group membership and partition ownership change when consumers join or leave.</w:t>
+        <w:t>Inspect group lag and perform a controlled replay.</w:t>
       </w:r>
     </w:p>
     <w:p>
@@ -1337,7 +1449,7 @@
         <w:t xml:space="preserve">What you learn: </w:t>
       </w:r>
       <w:r>
-        <w:t>Rebalancing is a core Day 3 theory topic. The lab evidence is group membership, assignment movement and temporary lag changes.</w:t>
+        <w:t>Day 2 used `--from-beginning` for simple replay. Day 3 uses committed offsets and explicit group offset reset.</w:t>
       </w:r>
     </w:p>
     <w:p>
@@ -1350,12 +1462,17 @@
     </w:p>
     <w:p>
       <w:r>
-        <w:t>docker compose exec broker1 kafka-console-consumer --bootstrap-server broker1:29092,broker2:29092,broker3:29092 --topic orders-replicated --group cg-live --from-beginning --property print.partition=true --property print.offset=true</w:t>
-      </w:r>
-    </w:p>
-    <w:p>
-      <w:r>
-        <w:t>docker compose exec broker1 kafka-consumer-groups --bootstrap-server broker1:29092,broker2:29092,broker3:29092 --describe --group cg-live</w:t>
+        <w:t>docker compose exec broker1 kafka-consumer-groups --bootstrap-server broker1:29092,broker2:29092,broker3:29092 --describe --group cg-day3-python</w:t>
+      </w:r>
+    </w:p>
+    <w:p>
+      <w:r>
+        <w:t>docker compose exec broker1 kafka-consumer-groups --bootstrap-server broker1:29092,broker2:29092,broker3:29092 --group cg-day3-python --topic orders-replicated --reset-offsets --to-earliest --dry-run</w:t>
+      </w:r>
+    </w:p>
+    <w:p>
+      <w:r>
+        <w:t>docker compose exec broker1 kafka-consumer-groups --bootstrap-server broker1:29092,broker2:29092,broker3:29092 --group cg-day3-python --topic orders-replicated --reset-offsets --to-earliest --execute</w:t>
       </w:r>
     </w:p>
     <w:p>
@@ -1368,12 +1485,17 @@
     </w:p>
     <w:p>
       <w:r>
-        <w:t>docker compose exec broker1 kafka-console-consumer --bootstrap-server broker1:29092,broker2:29092,broker3:29092 --topic orders-replicated --group cg-live --from-beginning --property print.partition=true --property print.offset=true</w:t>
-      </w:r>
-    </w:p>
-    <w:p>
-      <w:r>
-        <w:t>docker compose exec broker1 kafka-consumer-groups --bootstrap-server broker1:29092,broker2:29092,broker3:29092 --describe --group cg-live</w:t>
+        <w:t>docker compose exec broker1 kafka-consumer-groups --bootstrap-server broker1:29092,broker2:29092,broker3:29092 --describe --group cg-day3-python</w:t>
+      </w:r>
+    </w:p>
+    <w:p>
+      <w:r>
+        <w:t>docker compose exec broker1 kafka-consumer-groups --bootstrap-server broker1:29092,broker2:29092,broker3:29092 --group cg-day3-python --topic orders-replicated --reset-offsets --to-earliest --dry-run</w:t>
+      </w:r>
+    </w:p>
+    <w:p>
+      <w:r>
+        <w:t>docker compose exec broker1 kafka-consumer-groups --bootstrap-server broker1:29092,broker2:29092,broker3:29092 --group cg-day3-python --topic orders-replicated --reset-offsets --to-earliest --execute</w:t>
       </w:r>
     </w:p>
     <w:p>
@@ -1384,7 +1506,7 @@
         <w:t xml:space="preserve">Explanation: </w:t>
       </w:r>
       <w:r>
-        <w:t>Run the consumer command in two separate terminals with the same group id. Stop one consumer with Ctrl+C and describe the group again. Kafka moves partition ownership among the remaining active members.</w:t>
+        <w:t>Use `--dry-run` first to see the planned offset change. Use `--execute` only when you intentionally want replay.</w:t>
       </w:r>
     </w:p>
     <w:p>
@@ -1395,7 +1517,7 @@
         <w:t xml:space="preserve">Mini-check: </w:t>
       </w:r>
       <w:r>
-        <w:t>Why can adding a consumer cause a short processing pause?</w:t>
+        <w:t>Why can replay be risky?</w:t>
       </w:r>
     </w:p>
     <w:p>
@@ -1406,7 +1528,7 @@
         <w:t xml:space="preserve">Solution: </w:t>
       </w:r>
       <w:r>
-        <w:t>The group must rebalance partition ownership before all members resume normal processing.</w:t>
+        <w:t>Replay can repeat downstream side effects unless the downstream process is idempotent.</w:t>
       </w:r>
     </w:p>
     <w:p>
@@ -1417,7 +1539,7 @@
         <w:t xml:space="preserve">Evidence to capture: </w:t>
       </w:r>
       <w:r>
-        <w:t>Consumer group description before and after a second consumer joins or leaves.</w:t>
+        <w:t>Dry-run and execute output showing the offset reset plan and result.</w:t>
       </w:r>
     </w:p>
     <w:p>
@@ -1425,7 +1547,7 @@
         <w:pStyle w:val="Heading1"/>
       </w:pPr>
       <w:r>
-        <w:t>Exercise 11: Inspect Lag and Reset Offsets</w:t>
+        <w:t>Exercise 12: Run the FileStream Source Connector</w:t>
       </w:r>
     </w:p>
     <w:p>
@@ -1436,7 +1558,7 @@
         <w:t xml:space="preserve">Goal: </w:t>
       </w:r>
       <w:r>
-        <w:t>Inspect group lag and perform a controlled replay.</w:t>
+        <w:t>Move lines from a local file into Kafka using Kafka Connect.</w:t>
       </w:r>
     </w:p>
     <w:p>
@@ -1447,7 +1569,7 @@
         <w:t xml:space="preserve">What you learn: </w:t>
       </w:r>
       <w:r>
-        <w:t>Day 2 used `--from-beginning` for simple replay. Day 3 uses committed offsets and explicit group offset reset.</w:t>
+        <w:t>Day 2 produced records directly into Kafka. Day 3 uses Kafka Connect to move external data into Kafka.</w:t>
       </w:r>
     </w:p>
     <w:p>
@@ -1460,17 +1582,12 @@
     </w:p>
     <w:p>
       <w:r>
-        <w:t>docker compose exec broker1 kafka-consumer-groups --bootstrap-server broker1:29092,broker2:29092,broker3:29092 --describe --group cg-day3-python</w:t>
-      </w:r>
-    </w:p>
-    <w:p>
-      <w:r>
-        <w:t>docker compose exec broker1 kafka-consumer-groups --bootstrap-server broker1:29092,broker2:29092,broker3:29092 --group cg-day3-python --topic orders-replicated --reset-offsets --to-earliest --dry-run</w:t>
-      </w:r>
-    </w:p>
-    <w:p>
-      <w:r>
-        <w:t>docker compose exec broker1 kafka-consumer-groups --bootstrap-server broker1:29092,broker2:29092,broker3:29092 --group cg-day3-python --topic orders-replicated --reset-offsets --to-earliest --execute</w:t>
+        <w:t>curl -X DELETE http://localhost:8083/connectors/fs-source-connector</w:t>
+      </w:r>
+    </w:p>
+    <w:p>
+      <w:r>
+        <w:t>curl -X POST -H "Content-Type: application/json" --data @connector-source.json http://localhost:8083/connectors</w:t>
       </w:r>
     </w:p>
     <w:p>
@@ -1483,17 +1600,12 @@
     </w:p>
     <w:p>
       <w:r>
-        <w:t>docker compose exec broker1 kafka-consumer-groups --bootstrap-server broker1:29092,broker2:29092,broker3:29092 --describe --group cg-day3-python</w:t>
-      </w:r>
-    </w:p>
-    <w:p>
-      <w:r>
-        <w:t>docker compose exec broker1 kafka-consumer-groups --bootstrap-server broker1:29092,broker2:29092,broker3:29092 --group cg-day3-python --topic orders-replicated --reset-offsets --to-earliest --dry-run</w:t>
-      </w:r>
-    </w:p>
-    <w:p>
-      <w:r>
-        <w:t>docker compose exec broker1 kafka-consumer-groups --bootstrap-server broker1:29092,broker2:29092,broker3:29092 --group cg-day3-python --topic orders-replicated --reset-offsets --to-earliest --execute</w:t>
+        <w:t>curl -X DELETE http://localhost:8083/connectors/fs-source-connector</w:t>
+      </w:r>
+    </w:p>
+    <w:p>
+      <w:r>
+        <w:t>curl -X POST -H "Content-Type: application/json" --data @connector-source.json http://localhost:8083/connectors</w:t>
       </w:r>
     </w:p>
     <w:p>
@@ -1504,7 +1616,7 @@
         <w:t xml:space="preserve">Explanation: </w:t>
       </w:r>
       <w:r>
-        <w:t>Use `--dry-run` first to see the planned offset change. Use `--execute` only when you intentionally want replay.</w:t>
+        <w:t>If the DELETE command returns 404, that only means the connector did not exist yet. The source connector reads `/data/input/produce.txt` inside the Connect container and writes records to `fs-source`.</w:t>
       </w:r>
     </w:p>
     <w:p>
@@ -1515,7 +1627,7 @@
         <w:t xml:space="preserve">Mini-check: </w:t>
       </w:r>
       <w:r>
-        <w:t>Why can replay be risky?</w:t>
+        <w:t>What direction does a source connector move data?</w:t>
       </w:r>
     </w:p>
     <w:p>
@@ -1526,7 +1638,7 @@
         <w:t xml:space="preserve">Solution: </w:t>
       </w:r>
       <w:r>
-        <w:t>Replay can repeat downstream side effects unless the downstream process is idempotent.</w:t>
+        <w:t>A source connector moves data from an external system into Kafka.</w:t>
       </w:r>
     </w:p>
     <w:p>
@@ -1537,7 +1649,7 @@
         <w:t xml:space="preserve">Evidence to capture: </w:t>
       </w:r>
       <w:r>
-        <w:t>Dry-run and execute output showing the offset reset plan and result.</w:t>
+        <w:t>Connector RUNNING status and three records consumed from `fs-source`.</w:t>
       </w:r>
     </w:p>
     <w:p>
@@ -1545,7 +1657,7 @@
         <w:pStyle w:val="Heading1"/>
       </w:pPr>
       <w:r>
-        <w:t>Exercise 12: Run the FileStream Source Connector</w:t>
+        <w:t>Exercise 13: Run the FileStream Sink Connector</w:t>
       </w:r>
     </w:p>
     <w:p>
@@ -1556,7 +1668,7 @@
         <w:t xml:space="preserve">Goal: </w:t>
       </w:r>
       <w:r>
-        <w:t>Move lines from a local file into Kafka using Kafka Connect.</w:t>
+        <w:t>Move Kafka records from `fs-source` into a local output file.</w:t>
       </w:r>
     </w:p>
     <w:p>
@@ -1567,7 +1679,7 @@
         <w:t xml:space="preserve">What you learn: </w:t>
       </w:r>
       <w:r>
-        <w:t>Day 2 produced records directly into Kafka. Day 3 uses Kafka Connect to move external data into Kafka.</w:t>
+        <w:t>Day 2 consumed records with a Python application. Day 3 also demonstrates a managed sink connector as another consumer of Kafka records.</w:t>
       </w:r>
     </w:p>
     <w:p>
@@ -1580,22 +1692,19 @@
     </w:p>
     <w:p>
       <w:r>
-        <w:t>curl -X DELETE http://localhost:8083/connectors/fs-source-connector</w:t>
-      </w:r>
-    </w:p>
-    <w:p>
-      <w:r>
-        <w:t>curl -X POST -H "Content-Type: application/json" --data @connector-source.json http://localhost:8083/connectors</w:t>
-      </w:r>
-    </w:p>
-    <w:p>
-      <w:r>
-        <w:t>curl http://localhost:8083/connectors/fs-source-connector/status</w:t>
-      </w:r>
-    </w:p>
-    <w:p>
-      <w:r>
-        <w:t>docker compose exec broker1 kafka-console-consumer --bootstrap-server broker1:29092,broker2:29092,broker3:29092 --topic fs-source --from-beginning --timeout-ms 15000 --max-messages 3</w:t>
+        <w:t>type nul &gt; data\output\consume.txt</w:t>
+        <w:br/>
+        <w:t>curl -X DELETE http://localhost:8083/connectors/fs-sink-connector</w:t>
+      </w:r>
+    </w:p>
+    <w:p>
+      <w:r>
+        <w:t>curl -X POST -H "Content-Type: application/json" --data @connector-sink.json http://localhost:8083/connectors</w:t>
+      </w:r>
+    </w:p>
+    <w:p>
+      <w:r>
+        <w:t>type data\output\consume.txt</w:t>
       </w:r>
     </w:p>
     <w:p>
@@ -1608,22 +1717,123 @@
     </w:p>
     <w:p>
       <w:r>
-        <w:t>curl -X DELETE http://localhost:8083/connectors/fs-source-connector</w:t>
-      </w:r>
-    </w:p>
-    <w:p>
-      <w:r>
-        <w:t>curl -X POST -H "Content-Type: application/json" --data @connector-source.json http://localhost:8083/connectors</w:t>
-      </w:r>
-    </w:p>
-    <w:p>
-      <w:r>
-        <w:t>curl http://localhost:8083/connectors/fs-source-connector/status</w:t>
-      </w:r>
-    </w:p>
-    <w:p>
-      <w:r>
-        <w:t>docker compose exec broker1 kafka-console-consumer --bootstrap-server broker1:29092,broker2:29092,broker3:29092 --topic fs-source --from-beginning --timeout-ms 15000 --max-messages 3</w:t>
+        <w:t>: &gt; data/output/consume.txt</w:t>
+        <w:br/>
+        <w:t>curl -X DELETE http://localhost:8083/connectors/fs-sink-connector</w:t>
+      </w:r>
+    </w:p>
+    <w:p>
+      <w:r>
+        <w:t>curl -X POST -H "Content-Type: application/json" --data @connector-sink.json http://localhost:8083/connectors</w:t>
+      </w:r>
+    </w:p>
+    <w:p>
+      <w:r>
+        <w:t>Explanation: Clear `data/output/consume.txt` before registering the sink so old lab output does not look like new connector output. If the DELETE command returns 404, that only means the connector did not exist yet. The sink connector reads Kafka topic `fs-source` and writes `/data/output/consume.txt` inside the Connect container.</w:t>
+      </w:r>
+    </w:p>
+    <w:p>
+      <w:r>
+        <w:rPr>
+          <w:b/>
+        </w:rPr>
+        <w:t xml:space="preserve">Mini-check: </w:t>
+      </w:r>
+      <w:r>
+        <w:t>Why check both connector status and output file contents?</w:t>
+      </w:r>
+    </w:p>
+    <w:p>
+      <w:r>
+        <w:rPr>
+          <w:b/>
+        </w:rPr>
+        <w:t xml:space="preserve">Solution: </w:t>
+      </w:r>
+      <w:r>
+        <w:t>RUNNING proves the task is alive. The output file proves the end-to-end data path works.</w:t>
+      </w:r>
+    </w:p>
+    <w:p>
+      <w:r>
+        <w:rPr>
+          <w:b/>
+        </w:rPr>
+        <w:t xml:space="preserve">Evidence to capture: </w:t>
+      </w:r>
+      <w:r>
+        <w:t>Connector RUNNING status and `consume.txt` containing the same lines as the input file.</w:t>
+      </w:r>
+    </w:p>
+    <w:p>
+      <w:pPr>
+        <w:pStyle w:val="Heading1"/>
+      </w:pPr>
+      <w:r>
+        <w:t>Exercise 14: Restart Connect and Troubleshoot Connector State</w:t>
+      </w:r>
+    </w:p>
+    <w:p>
+      <w:r>
+        <w:rPr>
+          <w:b/>
+        </w:rPr>
+        <w:t xml:space="preserve">Goal: </w:t>
+      </w:r>
+      <w:r>
+        <w:t>Prove that connector configuration and offsets survive a worker restart.</w:t>
+      </w:r>
+    </w:p>
+    <w:p>
+      <w:r>
+        <w:rPr>
+          <w:b/>
+        </w:rPr>
+        <w:t xml:space="preserve">What you learn: </w:t>
+      </w:r>
+      <w:r>
+        <w:t>Connect theory includes workers, tasks, internal topics and recovery. This exercise checks status and the actual data path after a restart.</w:t>
+      </w:r>
+    </w:p>
+    <w:p>
+      <w:r>
+        <w:rPr>
+          <w:b/>
+        </w:rPr>
+        <w:t>Windows Command Prompt</w:t>
+      </w:r>
+    </w:p>
+    <w:p>
+      <w:r>
+        <w:t>docker compose restart connect</w:t>
+      </w:r>
+    </w:p>
+    <w:p>
+      <w:r>
+        <w:t>docker compose exec -T connect bash -lc "echo order-004^|customer=C107^|amount=32.50^|status=shipped &gt;&gt; /data/input/produce.txt"</w:t>
+      </w:r>
+    </w:p>
+    <w:p>
+      <w:r>
+        <w:t>type data\output\consume.txt</w:t>
+      </w:r>
+    </w:p>
+    <w:p>
+      <w:r>
+        <w:rPr>
+          <w:b/>
+        </w:rPr>
+        <w:t>macOS / Linux Bash</w:t>
+      </w:r>
+    </w:p>
+    <w:p>
+      <w:r>
+        <w:t>docker compose restart connect</w:t>
+      </w:r>
+    </w:p>
+    <w:p>
+      <w:r>
+        <w:t>docker compose exec -T connect bash -lc 'echo "order-004|customer=C107|amount=32.50|status=shipped" &gt;&gt; /data/input/produce.txt'</w:t>
       </w:r>
     </w:p>
     <w:p>
@@ -1634,7 +1844,7 @@
         <w:t xml:space="preserve">Explanation: </w:t>
       </w:r>
       <w:r>
-        <w:t>If the DELETE command returns 404, that only means the connector did not exist yet. The source connector reads `/data/input/produce.txt` inside the Connect container and writes records to `fs-source`.</w:t>
+        <w:t>The status endpoints show whether the connector and task are RUNNING. The output file proves recovery at the data-path level.</w:t>
       </w:r>
     </w:p>
     <w:p>
@@ -1645,7 +1855,7 @@
         <w:t xml:space="preserve">Mini-check: </w:t>
       </w:r>
       <w:r>
-        <w:t>What direction does a source connector move data?</w:t>
+        <w:t>What remembers source progress in distributed Connect mode?</w:t>
       </w:r>
     </w:p>
     <w:p>
@@ -1656,7 +1866,7 @@
         <w:t xml:space="preserve">Solution: </w:t>
       </w:r>
       <w:r>
-        <w:t>A source connector moves data from an external system into Kafka.</w:t>
+        <w:t>The Connect offset storage topic stores source connector progress.</w:t>
       </w:r>
     </w:p>
     <w:p>
@@ -1667,7 +1877,7 @@
         <w:t xml:space="preserve">Evidence to capture: </w:t>
       </w:r>
       <w:r>
-        <w:t>Connector RUNNING status and three records consumed from `fs-source`.</w:t>
+        <w:t>Connector statuses after restart and one new output line in `consume.txt`.</w:t>
       </w:r>
     </w:p>
     <w:p>
@@ -1675,7 +1885,7 @@
         <w:pStyle w:val="Heading1"/>
       </w:pPr>
       <w:r>
-        <w:t>Exercise 13: Run the FileStream Sink Connector</w:t>
+        <w:t>Exercise 15: Choose the Right Kafka Ecosystem Tool</w:t>
       </w:r>
     </w:p>
     <w:p>
@@ -1686,7 +1896,7 @@
         <w:t xml:space="preserve">Goal: </w:t>
       </w:r>
       <w:r>
-        <w:t>Move Kafka records from `fs-source` into a local output file.</w:t>
+        <w:t>Connect the final ecosystem theory slides to practical tool selection.</w:t>
       </w:r>
     </w:p>
     <w:p>
@@ -1697,7 +1907,7 @@
         <w:t xml:space="preserve">What you learn: </w:t>
       </w:r>
       <w:r>
-        <w:t>Day 2 consumed records with a Python application. Day 3 also demonstrates a managed sink connector as another consumer of Kafka records.</w:t>
+        <w:t>The final Day 3 theory section introduces tools learners will meet later. This exercise prevents tool names from becoming memorized labels without use cases.</w:t>
       </w:r>
     </w:p>
     <w:p>
@@ -1710,22 +1920,27 @@
     </w:p>
     <w:p>
       <w:r>
-        <w:t>curl -X DELETE http://localhost:8083/connectors/fs-sink-connector</w:t>
-      </w:r>
-    </w:p>
-    <w:p>
-      <w:r>
-        <w:t>curl -X POST -H "Content-Type: application/json" --data @connector-sink.json http://localhost:8083/connectors</w:t>
-      </w:r>
-    </w:p>
-    <w:p>
-      <w:r>
-        <w:t>curl http://localhost:8083/connectors/fs-sink-connector/status</w:t>
-      </w:r>
-    </w:p>
-    <w:p>
-      <w:r>
-        <w:t>type data\output\consume.txt</w:t>
+        <w:t>echo Use Kafka Connect for managed source/sink integration.</w:t>
+      </w:r>
+    </w:p>
+    <w:p>
+      <w:r>
+        <w:t>echo Use Kafka Streams for Java stream processing applications.</w:t>
+      </w:r>
+    </w:p>
+    <w:p>
+      <w:r>
+        <w:t>echo Use ksqlDB for SQL-style streaming queries.</w:t>
+      </w:r>
+    </w:p>
+    <w:p>
+      <w:r>
+        <w:t>echo Use Schema Registry for schema compatibility.</w:t>
+      </w:r>
+    </w:p>
+    <w:p>
+      <w:r>
+        <w:t>echo Use MirrorMaker 2 for cluster-to-cluster replication.</w:t>
       </w:r>
     </w:p>
     <w:p>
@@ -1738,22 +1953,27 @@
     </w:p>
     <w:p>
       <w:r>
-        <w:t>curl -X DELETE http://localhost:8083/connectors/fs-sink-connector</w:t>
-      </w:r>
-    </w:p>
-    <w:p>
-      <w:r>
-        <w:t>curl -X POST -H "Content-Type: application/json" --data @connector-sink.json http://localhost:8083/connectors</w:t>
-      </w:r>
-    </w:p>
-    <w:p>
-      <w:r>
-        <w:t>curl http://localhost:8083/connectors/fs-sink-connector/status</w:t>
-      </w:r>
-    </w:p>
-    <w:p>
-      <w:r>
-        <w:t>cat data/output/consume.txt</w:t>
+        <w:t>echo 'Use Kafka Connect for managed source/sink integration.'</w:t>
+      </w:r>
+    </w:p>
+    <w:p>
+      <w:r>
+        <w:t>echo 'Use Kafka Streams for Java stream processing applications.'</w:t>
+      </w:r>
+    </w:p>
+    <w:p>
+      <w:r>
+        <w:t>echo 'Use ksqlDB for SQL-style streaming queries.'</w:t>
+      </w:r>
+    </w:p>
+    <w:p>
+      <w:r>
+        <w:t>echo 'Use Schema Registry for schema compatibility.'</w:t>
+      </w:r>
+    </w:p>
+    <w:p>
+      <w:r>
+        <w:t>echo 'Use MirrorMaker 2 for cluster-to-cluster replication.'</w:t>
       </w:r>
     </w:p>
     <w:p>
@@ -1764,7 +1984,7 @@
         <w:t xml:space="preserve">Explanation: </w:t>
       </w:r>
       <w:r>
-        <w:t>If the DELETE command returns 404, that only means the connector did not exist yet. The sink connector reads Kafka topic `fs-source` and writes `/data/output/consume.txt` inside the Connect container.</w:t>
+        <w:t>This is a knowledge-check exercise, not a service startup exercise. Learners should explain why each tool fits its use case.</w:t>
       </w:r>
     </w:p>
     <w:p>
@@ -1775,7 +1995,7 @@
         <w:t xml:space="preserve">Mini-check: </w:t>
       </w:r>
       <w:r>
-        <w:t>Why check both connector status and output file contents?</w:t>
+        <w:t>Which tool is used in this lab to move file data into and out of Kafka?</w:t>
       </w:r>
     </w:p>
     <w:p>
@@ -1786,7 +2006,7 @@
         <w:t xml:space="preserve">Solution: </w:t>
       </w:r>
       <w:r>
-        <w:t>RUNNING proves the task is alive. The output file proves the end-to-end data path works.</w:t>
+        <w:t>Kafka Connect, through FileStream source and sink connectors.</w:t>
       </w:r>
     </w:p>
     <w:p>
@@ -1797,50 +2017,240 @@
         <w:t xml:space="preserve">Evidence to capture: </w:t>
       </w:r>
       <w:r>
-        <w:t>Connector RUNNING status and `consume.txt` containing the same lines as the input file.</w:t>
+        <w:t>A short written mapping of tool name to use case.</w:t>
       </w:r>
     </w:p>
     <w:p>
       <w:pPr>
-        <w:pStyle w:val="Heading1"/>
+        <w:pStyle w:val="Heading2"/>
       </w:pPr>
       <w:r>
-        <w:t>Exercise 14: Restart Connect and Troubleshoot Connector State</w:t>
-      </w:r>
-    </w:p>
-    <w:p>
-      <w:r>
-        <w:rPr>
-          <w:b/>
-        </w:rPr>
-        <w:t xml:space="preserve">Goal: </w:t>
-      </w:r>
-      <w:r>
-        <w:t>Prove that connector configuration and offsets survive a worker restart.</w:t>
-      </w:r>
-    </w:p>
-    <w:p>
-      <w:r>
-        <w:rPr>
-          <w:b/>
-        </w:rPr>
-        <w:t xml:space="preserve">What you learn: </w:t>
-      </w:r>
-      <w:r>
-        <w:t>Connect theory includes workers, tasks, internal topics and recovery. This exercise checks status and the actual data path after a restart.</w:t>
-      </w:r>
-    </w:p>
-    <w:p>
-      <w:r>
-        <w:rPr>
-          <w:b/>
-        </w:rPr>
-        <w:t>Windows Command Prompt</w:t>
-      </w:r>
-    </w:p>
-    <w:p>
-      <w:r>
-        <w:t>docker compose restart connect</w:t>
+        <w:t>Slide Mini-Exercise Coverage and Optional Extensions</w:t>
+      </w:r>
+    </w:p>
+    <w:p>
+      <w:r>
+        <w:t>Purpose: The slides include several mini-exercises and knowledge checks. The numbered lab already covers most of them, but the notes below make the coverage explicit and add optional hands-on extensions for learners who need more practice.</w:t>
+      </w:r>
+    </w:p>
+    <w:p>
+      <w:pPr>
+        <w:pStyle w:val="Heading3"/>
+      </w:pPr>
+      <w:r>
+        <w:t>Coverage summary</w:t>
+      </w:r>
+    </w:p>
+    <w:p>
+      <w:r>
+        <w:t>Consumer groups mini-exercise: covered by Exercises 9 and 10. Exercise 9 proves independent group offsets. Exercise 10 proves active partition assignment and rebalance. Optional Extension A below matches the six-partition scenario from the slides more closely.</w:t>
+      </w:r>
+    </w:p>
+    <w:p>
+      <w:r>
+        <w:t>Offsets and lag mini-exercise: covered by Exercises 8 and 11. Exercise 8 commits manually after processing. Exercise 11 describes lag and resets offsets. Optional Extension B below creates a clearer 100-message backlog.</w:t>
+      </w:r>
+    </w:p>
+    <w:p>
+      <w:r>
+        <w:t>Replication and high availability mini-exercise: covered by Exercises 4 and 5. The lab creates RF=3 topics, stops one broker, observes ISR shrink, produces with acks=all, and verifies ISR recovery. The min.insync.replicas=1 and unclean leader election parts are treated as guided discussion unless the trainer wants an advanced failure lab.</w:t>
+      </w:r>
+    </w:p>
+    <w:p>
+      <w:r>
+        <w:t>Connector configuration mini-exercise: covered by Exercises 12, 13 and 14 using FileStream connectors. The JDBC connector shown in the slides is a design example only in Day 3 because this folder does not include a database service or JDBC connector plugin. Day 4 introduces database-origin events.</w:t>
+      </w:r>
+    </w:p>
+    <w:p>
+      <w:r>
+        <w:t>Connector troubleshooting mini-exercise: covered by Exercise 14 and the troubleshooting checklist below. Learners should prove status and data path before restarting services.</w:t>
+      </w:r>
+    </w:p>
+    <w:p>
+      <w:pPr>
+        <w:pStyle w:val="Heading3"/>
+      </w:pPr>
+      <w:r>
+        <w:t>Optional Extension A: Six-Partition Consumer Group Scaling</w:t>
+      </w:r>
+    </w:p>
+    <w:p>
+      <w:r>
+        <w:t>Goal: Match the slide scenario that asks how six partitions are shared by three consumers, then what changes when another consumer joins.</w:t>
+      </w:r>
+    </w:p>
+    <w:p>
+      <w:r>
+        <w:t>Run once to create and load the topic:</w:t>
+      </w:r>
+    </w:p>
+    <w:p>
+      <w:r>
+        <w:t>docker compose exec broker1 kafka-topics --bootstrap-server broker1:29092,broker2:29092,broker3:29092 --create --if-not-exists --topic cg-six-demo --partitions 6 --replication-factor 3 --config min.insync.replicas=2</w:t>
+      </w:r>
+    </w:p>
+    <w:p>
+      <w:r>
+        <w:t>python3 producer.py --topic cg-six-demo --bootstrap localhost:9092 --count 12 --prefix cg-six</w:t>
+      </w:r>
+    </w:p>
+    <w:p>
+      <w:r>
+        <w:t>Open three terminals and run the same consumer command in each terminal:</w:t>
+      </w:r>
+    </w:p>
+    <w:p>
+      <w:r>
+        <w:t>docker compose exec broker1 kafka-console-consumer --bootstrap-server broker1:29092,broker2:29092,broker3:29092 --topic cg-six-demo --group cg-six --from-beginning --property print.partition=true --property print.offset=true</w:t>
+      </w:r>
+    </w:p>
+    <w:p>
+      <w:r>
+        <w:t>In a fourth terminal, describe the group:</w:t>
+      </w:r>
+    </w:p>
+    <w:p>
+      <w:r>
+        <w:t>docker compose exec broker1 kafka-consumer-groups --bootstrap-server broker1:29092,broker2:29092,broker3:29092 --describe --group cg-six</w:t>
+      </w:r>
+    </w:p>
+    <w:p>
+      <w:r>
+        <w:t>Expected observation: with six partitions and three active consumers, Kafka usually assigns about two partitions to each consumer. When a fourth consumer joins, the group rebalances and partitions are redistributed. With six partitions, a fourth consumer should not be idle; consumers become idle only when there are more active consumers than partitions.</w:t>
+      </w:r>
+    </w:p>
+    <w:p>
+      <w:r>
+        <w:t>Mini-check answer: cooperative sticky assignment minimizes disruption during rebalances. Static membership with group.instance.id helps avoid unnecessary rebalances during planned restarts.</w:t>
+      </w:r>
+    </w:p>
+    <w:p>
+      <w:pPr>
+        <w:pStyle w:val="Heading3"/>
+      </w:pPr>
+      <w:r>
+        <w:t>Optional Extension B: Clear 100-Message Lag and Replay Demo</w:t>
+      </w:r>
+    </w:p>
+    <w:p>
+      <w:r>
+        <w:t>Goal: Make lag easy to see by producing 100 records and consuming only part of them before describing the group.</w:t>
+      </w:r>
+    </w:p>
+    <w:p>
+      <w:r>
+        <w:t>docker compose exec broker1 kafka-topics --bootstrap-server broker1:29092,broker2:29092,broker3:29092 --create --if-not-exists --topic lag-demo --partitions 3 --replication-factor 3 --config min.insync.replicas=2</w:t>
+      </w:r>
+    </w:p>
+    <w:p>
+      <w:r>
+        <w:t>python3 producer.py --topic lag-demo --bootstrap localhost:9092 --count 100 --prefix lag-demo</w:t>
+      </w:r>
+    </w:p>
+    <w:p>
+      <w:r>
+        <w:t>python3 consumer.py --topic lag-demo --bootstrap localhost:9092 --group cg-lag-demo --max-messages 25 --reset earliest</w:t>
+      </w:r>
+    </w:p>
+    <w:p>
+      <w:r>
+        <w:t>docker compose exec broker1 kafka-consumer-groups --bootstrap-server broker1:29092,broker2:29092,broker3:29092 --describe --group cg-lag-demo</w:t>
+      </w:r>
+    </w:p>
+    <w:p>
+      <w:r>
+        <w:t>Expected observation: total lag should be about 75 because the group consumed and committed 25 of 100 records. Per-partition lag depends on how keys were distributed.</w:t>
+      </w:r>
+    </w:p>
+    <w:p>
+      <w:r>
+        <w:t>Replay the topic intentionally:</w:t>
+      </w:r>
+    </w:p>
+    <w:p>
+      <w:r>
+        <w:t>docker compose exec broker1 kafka-consumer-groups --bootstrap-server broker1:29092,broker2:29092,broker3:29092 --group cg-lag-demo --topic lag-demo --reset-offsets --to-earliest --dry-run</w:t>
+      </w:r>
+    </w:p>
+    <w:p>
+      <w:r>
+        <w:t>docker compose exec broker1 kafka-consumer-groups --bootstrap-server broker1:29092,broker2:29092,broker3:29092 --group cg-lag-demo --topic lag-demo --reset-offsets --to-earliest --execute</w:t>
+      </w:r>
+    </w:p>
+    <w:p>
+      <w:r>
+        <w:t>Mini-check answer: committed offsets are stored in __consumer_offsets. auto.offset.reset controls where a new group starts only when that group has no committed offset.</w:t>
+      </w:r>
+    </w:p>
+    <w:p>
+      <w:pPr>
+        <w:pStyle w:val="Heading3"/>
+      </w:pPr>
+      <w:r>
+        <w:t>Optional Extension C: min.insync.replicas Comparison</w:t>
+      </w:r>
+    </w:p>
+    <w:p>
+      <w:r>
+        <w:t>Goal: Understand why the lab uses min.insync.replicas=2 with replication factor 3.</w:t>
+      </w:r>
+    </w:p>
+    <w:p>
+      <w:r>
+        <w:t>Create a comparison topic:</w:t>
+      </w:r>
+    </w:p>
+    <w:p>
+      <w:r>
+        <w:t>docker compose exec broker1 kafka-topics --bootstrap-server broker1:29092,broker2:29092,broker3:29092 --create --if-not-exists --topic ha-orders-min1 --partitions 3 --replication-factor 3 --config min.insync.replicas=1</w:t>
+      </w:r>
+    </w:p>
+    <w:p>
+      <w:r>
+        <w:t>docker compose exec broker1 kafka-topics --bootstrap-server broker1:29092,broker2:29092,broker3:29092 --describe --topic ha-orders-min1</w:t>
+      </w:r>
+    </w:p>
+    <w:p>
+      <w:r>
+        <w:t>Discussion: min.insync.replicas=1 allows acks=all writes with only one in-sync replica, which improves write availability but weakens durability. min.insync.replicas=2 requires two in-sync replicas, which is safer for RF=3.</w:t>
+      </w:r>
+    </w:p>
+    <w:p>
+      <w:r>
+        <w:t>Do not stop two brokers in this local KRaft lab just to force the difference. The three brokers also form the controller quorum, and stopping two brokers can remove metadata quorum rather than demonstrating a clean producer-only durability comparison.</w:t>
+      </w:r>
+    </w:p>
+    <w:p>
+      <w:r>
+        <w:t>Mini-check answer: with RF=3 and min.insync.replicas=2, the lab can usually tolerate one broker failure for acks=all writes. unclean.leader.election.enable=true can elect a non-ISR replica faster, but it risks data loss.</w:t>
+      </w:r>
+    </w:p>
+    <w:p>
+      <w:pPr>
+        <w:pStyle w:val="Heading3"/>
+      </w:pPr>
+      <w:r>
+        <w:t>Optional Extension D: Connector Troubleshooting Route</w:t>
+      </w:r>
+    </w:p>
+    <w:p>
+      <w:r>
+        <w:t>Goal: Diagnose the first missing evidence instead of restarting randomly.</w:t>
+      </w:r>
+    </w:p>
+    <w:p>
+      <w:r>
+        <w:t>Use this order when FileStream source or sink output is missing:</w:t>
+      </w:r>
+    </w:p>
+    <w:p>
+      <w:r>
+        <w:t>docker compose ps</w:t>
+      </w:r>
+    </w:p>
+    <w:p>
+      <w:r>
+        <w:t>curl http://localhost:8083/connector-plugins</w:t>
       </w:r>
     </w:p>
     <w:p>
@@ -1855,40 +2265,7 @@
     </w:p>
     <w:p>
       <w:r>
-        <w:t>docker compose exec -T connect bash -lc "echo order-004^|customer=C107^|amount=32.50^|status=shipped &gt;&gt; /data/input/produce.txt"</w:t>
-      </w:r>
-    </w:p>
-    <w:p>
-      <w:r>
-        <w:t>type data\output\consume.txt</w:t>
-      </w:r>
-    </w:p>
-    <w:p>
-      <w:r>
-        <w:rPr>
-          <w:b/>
-        </w:rPr>
-        <w:t>macOS / Linux Bash</w:t>
-      </w:r>
-    </w:p>
-    <w:p>
-      <w:r>
-        <w:t>docker compose restart connect</w:t>
-      </w:r>
-    </w:p>
-    <w:p>
-      <w:r>
-        <w:t>curl http://localhost:8083/connectors/fs-source-connector/status</w:t>
-      </w:r>
-    </w:p>
-    <w:p>
-      <w:r>
-        <w:t>curl http://localhost:8083/connectors/fs-sink-connector/status</w:t>
-      </w:r>
-    </w:p>
-    <w:p>
-      <w:r>
-        <w:t>docker compose exec -T connect bash -lc 'echo "order-004|customer=C107|amount=32.50|status=shipped" &gt;&gt; /data/input/produce.txt'</w:t>
+        <w:t>docker compose exec broker1 kafka-console-consumer --bootstrap-server broker1:29092,broker2:29092,broker3:29092 --topic fs-source --from-beginning --timeout-ms 15000 --max-messages 3</w:t>
       </w:r>
     </w:p>
     <w:p>
@@ -1898,186 +2275,17 @@
     </w:p>
     <w:p>
       <w:r>
-        <w:rPr>
-          <w:b/>
-        </w:rPr>
-        <w:t xml:space="preserve">Explanation: </w:t>
-      </w:r>
-      <w:r>
-        <w:t>The status endpoints show whether the connector and task are RUNNING. The output file proves recovery at the data-path level.</w:t>
-      </w:r>
-    </w:p>
-    <w:p>
-      <w:r>
-        <w:rPr>
-          <w:b/>
-        </w:rPr>
-        <w:t xml:space="preserve">Mini-check: </w:t>
-      </w:r>
-      <w:r>
-        <w:t>What remembers source progress in distributed Connect mode?</w:t>
-      </w:r>
-    </w:p>
-    <w:p>
-      <w:r>
-        <w:rPr>
-          <w:b/>
-        </w:rPr>
-        <w:t xml:space="preserve">Solution: </w:t>
-      </w:r>
-      <w:r>
-        <w:t>The Connect offset storage topic stores source connector progress.</w:t>
-      </w:r>
-    </w:p>
-    <w:p>
-      <w:r>
-        <w:rPr>
-          <w:b/>
-        </w:rPr>
-        <w:t xml:space="preserve">Evidence to capture: </w:t>
-      </w:r>
-      <w:r>
-        <w:t>Connector statuses after restart and one new output line in `consume.txt`.</w:t>
-      </w:r>
-    </w:p>
-    <w:p>
-      <w:pPr>
-        <w:pStyle w:val="Heading1"/>
-      </w:pPr>
-      <w:r>
-        <w:t>Exercise 15: Choose the Right Kafka Ecosystem Tool</w:t>
-      </w:r>
-    </w:p>
-    <w:p>
-      <w:r>
-        <w:rPr>
-          <w:b/>
-        </w:rPr>
-        <w:t xml:space="preserve">Goal: </w:t>
-      </w:r>
-      <w:r>
-        <w:t>Connect the final ecosystem theory slides to practical tool selection.</w:t>
-      </w:r>
-    </w:p>
-    <w:p>
-      <w:r>
-        <w:rPr>
-          <w:b/>
-        </w:rPr>
-        <w:t xml:space="preserve">What you learn: </w:t>
-      </w:r>
-      <w:r>
-        <w:t>The final Day 3 theory section introduces tools learners will meet later. This exercise prevents tool names from becoming memorized labels without use cases.</w:t>
-      </w:r>
-    </w:p>
-    <w:p>
-      <w:r>
-        <w:rPr>
-          <w:b/>
-        </w:rPr>
-        <w:t>Windows Command Prompt</w:t>
-      </w:r>
-    </w:p>
-    <w:p>
-      <w:r>
-        <w:t>echo Use Kafka Connect for managed source/sink integration.</w:t>
-      </w:r>
-    </w:p>
-    <w:p>
-      <w:r>
-        <w:t>echo Use Kafka Streams for Java stream processing applications.</w:t>
-      </w:r>
-    </w:p>
-    <w:p>
-      <w:r>
-        <w:t>echo Use ksqlDB for SQL-style streaming queries.</w:t>
-      </w:r>
-    </w:p>
-    <w:p>
-      <w:r>
-        <w:t>echo Use Schema Registry for schema compatibility.</w:t>
-      </w:r>
-    </w:p>
-    <w:p>
-      <w:r>
-        <w:t>echo Use MirrorMaker 2 for cluster-to-cluster replication.</w:t>
-      </w:r>
-    </w:p>
-    <w:p>
-      <w:r>
-        <w:rPr>
-          <w:b/>
-        </w:rPr>
-        <w:t>macOS / Linux Bash</w:t>
-      </w:r>
-    </w:p>
-    <w:p>
-      <w:r>
-        <w:t>echo 'Use Kafka Connect for managed source/sink integration.'</w:t>
-      </w:r>
-    </w:p>
-    <w:p>
-      <w:r>
-        <w:t>echo 'Use Kafka Streams for Java stream processing applications.'</w:t>
-      </w:r>
-    </w:p>
-    <w:p>
-      <w:r>
-        <w:t>echo 'Use ksqlDB for SQL-style streaming queries.'</w:t>
-      </w:r>
-    </w:p>
-    <w:p>
-      <w:r>
-        <w:t>echo 'Use Schema Registry for schema compatibility.'</w:t>
-      </w:r>
-    </w:p>
-    <w:p>
-      <w:r>
-        <w:t>echo 'Use MirrorMaker 2 for cluster-to-cluster replication.'</w:t>
-      </w:r>
-    </w:p>
-    <w:p>
-      <w:r>
-        <w:rPr>
-          <w:b/>
-        </w:rPr>
-        <w:t xml:space="preserve">Explanation: </w:t>
-      </w:r>
-      <w:r>
-        <w:t>This is a knowledge-check exercise, not a service startup exercise. Learners should explain why each tool fits its use case.</w:t>
-      </w:r>
-    </w:p>
-    <w:p>
-      <w:r>
-        <w:rPr>
-          <w:b/>
-        </w:rPr>
-        <w:t xml:space="preserve">Mini-check: </w:t>
-      </w:r>
-      <w:r>
-        <w:t>Which tool is used in this lab to move file data into and out of Kafka?</w:t>
-      </w:r>
-    </w:p>
-    <w:p>
-      <w:r>
-        <w:rPr>
-          <w:b/>
-        </w:rPr>
-        <w:t xml:space="preserve">Solution: </w:t>
-      </w:r>
-      <w:r>
-        <w:t>Kafka Connect, through FileStream source and sink connectors.</w:t>
-      </w:r>
-    </w:p>
-    <w:p>
-      <w:r>
-        <w:rPr>
-          <w:b/>
-        </w:rPr>
-        <w:t xml:space="preserve">Evidence to capture: </w:t>
-      </w:r>
-      <w:r>
-        <w:t>A short written mapping of tool name to use case.</w:t>
+        <w:t>docker compose logs connect</w:t>
+      </w:r>
+    </w:p>
+    <w:p>
+      <w:r>
+        <w:t>Expected reasoning: RUNNING is necessary but not sufficient. Connector status proves the task is alive, consuming fs-source proves source ingestion, and consume.txt proves the sink wrote to the external file path.</w:t>
+      </w:r>
+    </w:p>
+    <w:p>
+      <w:r>
+        <w:t>JDBC slide note: To run the JDBC source example literally, the lab would need an added PostgreSQL service, JDBC connector plugin, connector JSON, seed table, and a topic verification step. That is intentionally outside Day 3 so learners can focus on Connect mechanics before database CDC on Day 4.</w:t>
       </w:r>
     </w:p>
     <w:p>

</xml_diff>